<commit_message>
Chimchar and Togekiss join the roster: the Fire striker and the Air controller
Both statblocks are the DM's sim-tested designs, transcribed verbatim.
Chimchar is the striker whose numbers climb as its hit points fall (Blaze
doubles its claws, adds 1d6 to everything, and unlocks Ember Shroud), plus
wall-running, a 20-foot burning-hoop emanation, a once-a-day comet, and a
retaliation reaction. Togekiss is the controller: blindness riding every
gleam, a three-round area shutdown in Sing, an ally buff on its Bonus Action,
and a reaction that spoils whoever hits it. Portraits generated against the
DM's reference art, four angles for Togekiss since he is hard to draw. Both
join the companion-card roster, which now also drops the bestiary's italic
lead-in from standalone cards, since it duplicated the subtitle and pushed
tall cards onto a second page.

Co-Authored-By: Claude Fable 5 <noreply@anthropic.com>
</commit_message>
<xml_diff>
--- a/characters/ghostbloom_statblock.docx
+++ b/characters/ghostbloom_statblock.docx
@@ -39,21 +39,6 @@
           <w:sz w:val="21"/>
         </w:rPr>
         <w:t>The party's companion, kept current with the bestiary. Her earlier form serves the Sessions 1 to 7 chronicle; the level-7 card is the one in play from the Earth Rift onward.</w:t>
-      </w:r>
-    </w:p>
-    <w:p>
-      <w:pPr>
-        <w:spacing w:after="80"/>
-      </w:pPr>
-      <w:r>
-        <w:rPr>
-          <w:rFonts w:ascii="Georgia" w:hAnsi="Georgia" w:cs="Georgia"/>
-          <w:b w:val="0"/>
-          <w:i/>
-          <w:color w:val="222222"/>
-          <w:sz w:val="21"/>
-        </w:rPr>
-        <w:t>Ghostbloom is the party's dearest companion, chosen in Session 3 as Floraburst, changed aboard the sinking Dutchman and again in Wraithpine's ghost-light. Her petals are glass-pale now and chime like frost; she floats, speaks in soft telepathy, and glows brighter near planar wounds. Some say she is Elaria's own little voice.</w:t>
       </w:r>
     </w:p>
     <w:tbl>
@@ -740,21 +725,6 @@
         </w:tc>
       </w:tr>
     </w:tbl>
-    <w:p>
-      <w:pPr>
-        <w:spacing w:after="80"/>
-      </w:pPr>
-      <w:r>
-        <w:rPr>
-          <w:rFonts w:ascii="Georgia" w:hAnsi="Georgia" w:cs="Georgia"/>
-          <w:b w:val="0"/>
-          <w:i/>
-          <w:color w:val="222222"/>
-          <w:sz w:val="21"/>
-        </w:rPr>
-        <w:t>The rift arc asks more of her than the road ever did. This is Ghostbloom as she stands at the party's side from the Earth Rift onward: the same creature, grown into the work. Her older card above is kept for the Sessions 1 to 7 chronicle.</w:t>
-      </w:r>
-    </w:p>
     <w:tbl>
       <w:tblPr>
         <w:tblW w:type="auto" w:w="0"/>

</xml_diff>